<commit_message>
Clarify filtered catalog result counts
Co-authored-by: Copilot <223556219+Copilot@users.noreply.github.com>
</commit_message>
<xml_diff>
--- a/docs/Library Desk Project Documentation - Print Ready.docx
+++ b/docs/Library Desk Project Documentation - Print Ready.docx
@@ -519,6 +519,16 @@
       </w:pPr>
       <w:r>
         <w:t xml:space="preserve">The following screenshots document the major application views.</w:t>
+      </w:r>
+    </w:p>
+    <w:p>
+      <w:r>
+        <w:t>The demonstration catalog contains four titles (10 copies total): Effective Java, Head First Java, Java Swing, and Object-Oriented Thought Process. The catalog screenshot shows all four. The Java search screenshot intentionally shows only the three matching titles; its “3 matching books” count is the filtered result count, not the total catalog size.</w:t>
+      </w:r>
+    </w:p>
+    <w:p>
+      <w:r>
+        <w:t>The sample library also includes two active members, Jordan Lee and Casey Morgan, and three loan-history records: Head First Java for Jordan Lee (returned), Effective Java for Jordan Lee (on loan), and Java Swing for Casey Morgan (on loan). The dashboard therefore shows four titles, eight available copies, two active members, two active loans, and zero overdue loans; its recent-activity list contains the three loan records.</w:t>
       </w:r>
     </w:p>
     <w:p>

</xml_diff>

<commit_message>
Align demo screenshots with saved library data
Co-authored-by: Copilot <223556219+Copilot@users.noreply.github.com>
</commit_message>
<xml_diff>
--- a/docs/Library Desk Project Documentation - Print Ready.docx
+++ b/docs/Library Desk Project Documentation - Print Ready.docx
@@ -523,12 +523,12 @@
     </w:p>
     <w:p>
       <w:r>
-        <w:t>The demonstration catalog contains four titles (10 copies total): Effective Java, Head First Java, Java Swing, and Object-Oriented Thought Process. The catalog screenshot shows all four. The Java search screenshot intentionally shows only the three matching titles; its “3 matching books” count is the filtered result count, not the total catalog size.</w:t>
-      </w:r>
-    </w:p>
-    <w:p>
-      <w:r>
-        <w:t>The sample library also includes two active members, Jordan Lee and Casey Morgan, and three loan-history records: Head First Java for Jordan Lee (returned), Effective Java for Jordan Lee (on loan), and Java Swing for Casey Morgan (on loan). The dashboard therefore shows four titles, eight available copies, two active members, two active loans, and zero overdue loans; its recent-activity list contains the three loan records.</w:t>
+        <w:t>The demonstration catalog contains five titles (13 copies total): Atomic Habits, Effective Java, Head First Java, Java Swing, and Object-Oriented Thought Process. The catalog screenshot shows all five. The Java search screenshot intentionally shows only the three matching titles; its “3 matching books” count is the filtered result count, not the total catalog size.</w:t>
+      </w:r>
+    </w:p>
+    <w:p>
+      <w:r>
+        <w:t>The sample library also includes two active members, Jordan Lee and Casey Morgan, plus the historical record for former member Ethan Carter. Its three loan-history records are: Atomic Habits for Ethan Carter (returned), Effective Java for Jordan Lee (on loan), and Java Swing for Casey Morgan (on loan). The dashboard therefore shows five titles, eleven available copies, two active members, two active loans, and zero overdue loans; its recent-activity list contains these three loan records.</w:t>
       </w:r>
     </w:p>
     <w:p>

</xml_diff>